<commit_message>
SC slow-wage-growth citizen-v2 completed to combined format: proposal spotlights, glossary, and legislative process glossary appended to the brief (4 pp combined, front brief still pp 1-2 in HTML and Word) plus standalone proposal-spotlights (2 pp); local-preemption correction propagated (fixed-floor bills keep the ban on higher local minimums); scans and vote pairs re-verified
Co-authored-by: CaptainWrechols <CaptainWrechols@users.noreply.github.com>
</commit_message>
<xml_diff>
--- a/briefs/south-carolina/slow-wage-growth/citizen-v2/appendices/appendices.docx
+++ b/briefs/south-carolina/slow-wage-growth/citizen-v2/appendices/appendices.docx
@@ -602,7 +602,7 @@
               <w:jc w:val="left"/>
             </w:pPr>
             <w:r>
-              <w:t xml:space="preserve">Would have set a state minimum wage of $10.10 an hour (or the federal rate if higher) and let local governments go higher.</w:t>
+              <w:t xml:space="preserve">Would have set a state minimum wage of $10.10 an hour (or the federal rate if higher); local governments still could not go higher.</w:t>
             </w:r>
           </w:p>
         </w:tc>
@@ -824,7 +824,7 @@
               <w:jc w:val="left"/>
             </w:pPr>
             <w:r>
-              <w:t xml:space="preserve">Would have set a state minimum wage of $13 an hour (or the federal rate if higher) and let local governments go higher.</w:t>
+              <w:t xml:space="preserve">Would have set a state minimum wage of $13 an hour (or the federal rate if higher); local governments still could not go higher.</w:t>
             </w:r>
           </w:p>
         </w:tc>
@@ -1268,7 +1268,7 @@
               <w:jc w:val="left"/>
             </w:pPr>
             <w:r>
-              <w:t xml:space="preserve">Would have set a state minimum wage of $15 an hour (or the federal rate if higher) and let local governments go higher.</w:t>
+              <w:t xml:space="preserve">Would have set a state minimum wage of $15 an hour (or the federal rate if higher); local governments still could not go higher.</w:t>
             </w:r>
           </w:p>
         </w:tc>
@@ -1342,7 +1342,7 @@
               <w:jc w:val="left"/>
             </w:pPr>
             <w:r>
-              <w:t xml:space="preserve">Would have set a state minimum wage of $13 an hour (or the federal rate if higher) and let local governments go higher.</w:t>
+              <w:t xml:space="preserve">Would have set a state minimum wage of $13 an hour (or the federal rate if higher); local governments still could not go higher.</w:t>
             </w:r>
           </w:p>
         </w:tc>
@@ -1860,7 +1860,7 @@
               <w:jc w:val="left"/>
             </w:pPr>
             <w:r>
-              <w:t xml:space="preserve">Would have set a state minimum wage of $10 an hour (or the federal rate if higher).</w:t>
+              <w:t xml:space="preserve">Would have set a state minimum wage of $10 an hour (or the federal rate if higher); local governments still could not go higher.</w:t>
             </w:r>
           </w:p>
         </w:tc>

</xml_diff>